<commit_message>
Lebenslauf: Anschrift und Kontaktdaten eintragen
Co-Authored-By: Claude Fable 5.1 <noreply@anthropic.com>
Claude-Session: https://claude.ai/code/session_01U9K3Tx6f83CBcdb2waDDwz
</commit_message>
<xml_diff>
--- a/lebenslauf/Lebenslauf_Teilzeit.docx
+++ b/lebenslauf/Lebenslauf_Teilzeit.docx
@@ -45,13 +45,11 @@
                 <w:rFonts w:ascii="Calibri" w:cs="Calibri" w:eastAsia="Calibri" w:hAnsi="Calibri"/>
                 <w:b/>
                 <w:bCs/>
-                <w:color w:val="C00000"/>
+                <w:color w:val="1F3A5F"/>
                 <w:sz w:val="40"/>
                 <w:szCs w:val="40"/>
-                <w:highlight w:val="yellow"/>
-                <w:highlightCs w:val="yellow"/>
-              </w:rPr>
-              <w:t xml:space="preserve">VORNAME NACHNAME</w:t>
+              </w:rPr>
+              <w:t xml:space="preserve">Harun Halit Özkan</w:t>
             </w:r>
           </w:p>
           <w:p>
@@ -81,18 +79,7 @@
                 <w:sz w:val="21"/>
                 <w:szCs w:val="21"/>
               </w:rPr>
-              <w:t xml:space="preserve">📍  </w:t>
-            </w:r>
-            <w:r>
-              <w:rPr>
-                <w:rFonts w:ascii="Calibri" w:cs="Calibri" w:eastAsia="Calibri" w:hAnsi="Calibri"/>
-                <w:color w:val="C00000"/>
-                <w:sz w:val="21"/>
-                <w:szCs w:val="21"/>
-                <w:highlight w:val="yellow"/>
-                <w:highlightCs w:val="yellow"/>
-              </w:rPr>
-              <w:t xml:space="preserve">Straße Nr., PLZ Ort</w:t>
+              <w:t xml:space="preserve">📍  Beilsteiner Straße 15, 74360 Ilsfeld</w:t>
             </w:r>
           </w:p>
           <w:p>
@@ -105,18 +92,7 @@
                 <w:sz w:val="21"/>
                 <w:szCs w:val="21"/>
               </w:rPr>
-              <w:t xml:space="preserve">📞  </w:t>
-            </w:r>
-            <w:r>
-              <w:rPr>
-                <w:rFonts w:ascii="Calibri" w:cs="Calibri" w:eastAsia="Calibri" w:hAnsi="Calibri"/>
-                <w:color w:val="C00000"/>
-                <w:sz w:val="21"/>
-                <w:szCs w:val="21"/>
-                <w:highlight w:val="yellow"/>
-                <w:highlightCs w:val="yellow"/>
-              </w:rPr>
-              <w:t xml:space="preserve">+49 1XX XXXXXXX</w:t>
+              <w:t xml:space="preserve">📞  0176 81305201</w:t>
             </w:r>
           </w:p>
           <w:p>
@@ -129,7 +105,7 @@
                 <w:sz w:val="21"/>
                 <w:szCs w:val="21"/>
               </w:rPr>
-              <w:t xml:space="preserve">✉  hn_player@hotmail.de</w:t>
+              <w:t xml:space="preserve">✉  harun.oezkan@icloud.com</w:t>
             </w:r>
           </w:p>
           <w:p>
@@ -1356,21 +1332,10 @@
       <w:r>
         <w:rPr>
           <w:rFonts w:ascii="Calibri" w:cs="Calibri" w:eastAsia="Calibri" w:hAnsi="Calibri"/>
-          <w:color w:val="C00000"/>
           <w:sz w:val="21"/>
           <w:szCs w:val="21"/>
-          <w:highlight w:val="yellow"/>
-          <w:highlightCs w:val="yellow"/>
-        </w:rPr>
-        <w:t xml:space="preserve">Ort</w:t>
-      </w:r>
-      <w:r>
-        <w:rPr>
-          <w:rFonts w:ascii="Calibri" w:cs="Calibri" w:eastAsia="Calibri" w:hAnsi="Calibri"/>
-          <w:sz w:val="21"/>
-          <w:szCs w:val="21"/>
-        </w:rPr>
-        <w:t xml:space="preserve">, </w:t>
+        </w:rPr>
+        <w:t xml:space="preserve">Ilsfeld, </w:t>
       </w:r>
       <w:r>
         <w:rPr>

</xml_diff>